<commit_message>
Update advocacy letter date and tighten wording to fit Google Docs
Dates the letter October 21, 2026 and trims about 15 words so the letter
stays on 3 pages with Google Docs line spacing as well as in Word.

Co-Authored-By: Claude Opus 5.5 <noreply@anthropic.com>
Claude-Session: https://claude.ai/code/session_01JReA7S81MbG6fFuEmQ8DPM
</commit_message>
<xml_diff>
--- a/Advocacy_Letter_Marchelino_Toma_SUSTAIN_2SS3.docx
+++ b/Advocacy_Letter_Marchelino_Toma_SUSTAIN_2SS3.docx
@@ -14,7 +14,7 @@
     </w:p>
     <w:p>
       <w:r>
-        <w:t>October 20, 2026</w:t>
+        <w:t>October 21, 2026</w:t>
       </w:r>
     </w:p>
     <w:p>
@@ -58,7 +58,7 @@
         <w:ind w:firstLine="720"/>
       </w:pPr>
       <w:r>
-        <w:t>Since last fall, sensors on a silver maple in Victoria Park and a black walnut in Captain Cornelius Park have tracked soil moisture at the roots, how much water each tree takes up, and the swelling and shrinking of the bark (City of Hamilton, n.d.). Residents suggested and voted on names for both trees, so Hamilton now knows them as Acer the Carbon Eraser and Bark Vader. The City turns the readings into posts written in each tree’s voice, and at our first meeting on October 1, Forestry staff suggested we write an expanded set. For residents, hearing from a thirsty maple in a familiar park makes a heat wave feel far more real than a chart ever could. Because the Climate Change Reserve helped fund the pilot, it already sits within your Office’s climate work (City of Hamilton, n.d.).</w:t>
+        <w:t>Since last fall, sensors on a silver maple in Victoria Park and a black walnut in Captain Cornelius Park have tracked soil moisture at the roots, how much water each tree takes up, and the swelling and shrinking of the bark (City of Hamilton, n.d.). Residents chose their names in a public contest, so Hamilton now knows them as Acer the Carbon Eraser and Bark Vader. The City turns the readings into posts in each tree’s voice, and at our first meeting on October 1, Forestry staff suggested we write more. For residents, hearing from a thirsty maple in a familiar park makes a heat wave feel more real than any chart. Because the Climate Change Reserve helped fund the pilot, it already sits within your Office’s climate work (City of Hamilton, n.d.).</w:t>
       </w:r>
     </w:p>
     <w:p>
@@ -74,7 +74,7 @@
         <w:ind w:firstLine="720"/>
       </w:pPr>
       <w:r>
-        <w:t>For now, the public mainly sees the readings through the trees’ posts and a dashboard. An early 2024 version of this idea, developed through CityLAB Hamilton, planned to make all collected data available through the City’s open data program (CityLAB Hamilton, 2024). This year, the Forestry Section asked CityLAB for help finding ways to use the pilot’s data for research and academic work (CityLAB Hamilton, 2026). Harvard Forest offers a useful model. Its talking red oak draws on more than 55 years of archived climate records, so each post rests on decades of evidence (Harvard Forest, n.d.). Hamilton can build a similar foundation with staff time rather than new equipment, by posting the readings on Open Hamilton every three months with a short guide to each sensor and any gaps, while CityLAB keeps matching student researchers to the data. Later, the same rule could apply to every Reserve project that collects environmental data. Residents would keep a voice they helped name, and teachers and researchers would gain local records they can trust.</w:t>
+        <w:t>For now, the public mainly sees the readings through the trees’ posts and a dashboard. An early 2024 version of this idea, developed through CityLAB Hamilton, planned to make all collected data available through the City’s open data program (CityLAB Hamilton, 2024). This year, the Forestry Section asked CityLAB how the pilot’s data could support research and academic work (CityLAB Hamilton, 2026). Harvard Forest offers a useful model. Its talking red oak draws on more than 55 years of archived climate records, so each post rests on decades of evidence (Harvard Forest, n.d.). Hamilton can do the same with staff time rather than new equipment, by posting the readings on Open Hamilton every three months with a short guide to each sensor and any gaps, while CityLAB keeps matching students to the data. Later, the same rule could apply to every Reserve project that collects environmental data. Residents would keep a voice they helped name, and researchers and teachers would gain trusted local records.</w:t>
       </w:r>
     </w:p>
     <w:p>

</xml_diff>